<commit_message>
feat(cuentas-cobro): radicado y fecha de notificacion exclusivos de Subgerencia
- Recuadro "Datos de Subgerencia" en el detalle de la cuenta: numero de
  radicado y fecha de notificacion al contratista, editables solo por
  Subgerencia (y el superadmin para corregir), en cualquier etapa. La base de
  datos (cc_datos) rechaza a los demas procesos.
- La fecha de notificacion reemplaza la casilla "Notificado al contratista":
  al registrarla marca la cuenta como notificada.
- El 3er filtro toma el radicado del recuadro; en la etapa queda la factura.
- El Excel exportado muestra la fecha en "Notificacion al Contratista".
- Esquema en sql/cuentas_cobro_v4.sql.
- Manual de uso actualizado a la version 1.1.

Co-Authored-By: Claude Opus 5.5 <noreply@anthropic.com>
</commit_message>
<xml_diff>
--- a/SEGUIMIENTO CUENTAS DE COBRO/Manual_Seguimiento_Cuentas_de_Cobro.docx
+++ b/SEGUIMIENTO CUENTAS DE COBRO/Manual_Seguimiento_Cuentas_de_Cobro.docx
@@ -84,7 +84,7 @@
           <w:color w:val="4A6A8A"/>
           <w:sz w:val="20"/>
         </w:rPr>
-        <w:t>Portal de Salud Pública HRNO · Versión 1.0 · Septiembre de 2026</w:t>
+        <w:t>Portal de Salud Pública HRNO · Versión 1.1 · Octubre de 2026</w:t>
       </w:r>
     </w:p>
     <w:p>
@@ -1169,7 +1169,46 @@
               <w:rPr>
                 <w:sz w:val="19"/>
               </w:rPr>
-              <w:t xml:space="preserve">Hacer el </w:t>
+              <w:t xml:space="preserve">Diligenciar, </w:t>
+            </w:r>
+            <w:r>
+              <w:rPr>
+                <w:b/>
+                <w:sz w:val="19"/>
+              </w:rPr>
+              <w:t>en exclusiva</w:t>
+            </w:r>
+            <w:r>
+              <w:rPr>
+                <w:sz w:val="19"/>
+              </w:rPr>
+              <w:t xml:space="preserve">, el </w:t>
+            </w:r>
+            <w:r>
+              <w:rPr>
+                <w:b/>
+                <w:sz w:val="19"/>
+              </w:rPr>
+              <w:t>número de radicado</w:t>
+            </w:r>
+            <w:r>
+              <w:rPr>
+                <w:sz w:val="19"/>
+              </w:rPr>
+              <w:t xml:space="preserve"> y la </w:t>
+            </w:r>
+            <w:r>
+              <w:rPr>
+                <w:b/>
+                <w:sz w:val="19"/>
+              </w:rPr>
+              <w:t>fecha de notificación al contratista</w:t>
+            </w:r>
+            <w:r>
+              <w:rPr>
+                <w:sz w:val="19"/>
+              </w:rPr>
+              <w:t xml:space="preserve">. Hacer el </w:t>
             </w:r>
             <w:r>
               <w:rPr>
@@ -1182,7 +1221,7 @@
               <w:rPr>
                 <w:sz w:val="19"/>
               </w:rPr>
-              <w:t xml:space="preserve"> (radicado y factura electrónica), la </w:t>
+              <w:t xml:space="preserve"> (factura electrónica), la </w:t>
             </w:r>
             <w:r>
               <w:rPr>
@@ -1208,7 +1247,7 @@
               <w:rPr>
                 <w:sz w:val="19"/>
               </w:rPr>
-              <w:t xml:space="preserve"> y las casillas de control (notificación, presupuesto, correo).</w:t>
+              <w:t xml:space="preserve"> y las casillas de control (presupuesto, correo).</w:t>
             </w:r>
           </w:p>
         </w:tc>
@@ -2973,7 +3012,21 @@
         <w:t>Datos:</w:t>
       </w:r>
       <w:r>
-        <w:t xml:space="preserve"> radicado, factura, estado SECOP II, supervisión, Tesorería, número ND y casillas de control de Subgerencia.</w:t>
+        <w:t xml:space="preserve"> radicado, factura, estado SECOP II, supervisión, Tesorería, número ND, fecha de notificación al contratista y casillas de control de Subgerencia.</w:t>
+      </w:r>
+    </w:p>
+    <w:p>
+      <w:pPr>
+        <w:pStyle w:val="ListBullet"/>
+      </w:pPr>
+      <w:r>
+        <w:rPr>
+          <w:b/>
+        </w:rPr>
+        <w:t>🏛 Datos de Subgerencia:</w:t>
+      </w:r>
+      <w:r>
+        <w:t xml:space="preserve"> recuadro para el radicado y la fecha de notificación (solo Subgerencia).</w:t>
       </w:r>
     </w:p>
     <w:p>
@@ -3020,7 +3073,8 @@
     <w:p>
       <w:pPr>
         <w:pStyle w:val="Heading1"/>
-        <w:pageBreakBefore/>
+        <w:pageBreakBefore w:val="0"/>
+        <w:spacing w:before="520"/>
       </w:pPr>
       <w:r>
         <w:t>6. Qué hace cada proceso, paso a paso</w:t>
@@ -3333,7 +3387,21 @@
         <w:pStyle w:val="Heading3"/>
       </w:pPr>
       <w:r>
-        <w:t>3er filtro: radicado y factura electrónica</w:t>
+        <w:t>Datos de Subgerencia: radicado y fecha de notificación</w:t>
+      </w:r>
+    </w:p>
+    <w:p>
+      <w:r>
+        <w:t xml:space="preserve">Solo el usuario de Subgerencia (y el superadministrador, para corregir) puede diligenciar estos dos datos. Los demás procesos los ven, pero no los pueden modificar. Se pueden registrar </w:t>
+      </w:r>
+      <w:r>
+        <w:rPr>
+          <w:b/>
+        </w:rPr>
+        <w:t>en cualquier etapa</w:t>
+      </w:r>
+      <w:r>
+        <w:t xml:space="preserve"> de la cuenta.</w:t>
       </w:r>
     </w:p>
     <w:p>
@@ -3349,7 +3417,16 @@
         <w:t xml:space="preserve">1.  </w:t>
       </w:r>
       <w:r>
-        <w:t xml:space="preserve">Abra la cuenta y escriba el </w:t>
+        <w:t xml:space="preserve">Abra la cuenta. En el recuadro </w:t>
+      </w:r>
+      <w:r>
+        <w:rPr>
+          <w:b/>
+        </w:rPr>
+        <w:t>🏛 Datos de Subgerencia</w:t>
+      </w:r>
+      <w:r>
+        <w:t xml:space="preserve"> escriba el </w:t>
       </w:r>
       <w:r>
         <w:rPr>
@@ -3358,25 +3435,16 @@
         <w:t>No. radicado</w:t>
       </w:r>
       <w:r>
-        <w:t xml:space="preserve"> y el </w:t>
+        <w:t xml:space="preserve"> y la </w:t>
       </w:r>
       <w:r>
         <w:rPr>
           <w:b/>
         </w:rPr>
-        <w:t>No. factura electrónica</w:t>
-      </w:r>
-      <w:r>
-        <w:t xml:space="preserve">. Puede pulsar </w:t>
-      </w:r>
-      <w:r>
-        <w:rPr>
-          <w:b/>
-        </w:rPr>
-        <w:t>Guardar</w:t>
-      </w:r>
-      <w:r>
-        <w:t xml:space="preserve"> si aún no va a aprobar.</w:t>
+        <w:t>Fecha de notificación al contratista</w:t>
+      </w:r>
+      <w:r>
+        <w:t>.</w:t>
       </w:r>
     </w:p>
     <w:p>
@@ -3398,10 +3466,19 @@
         <w:rPr>
           <w:b/>
         </w:rPr>
-        <w:t>✔ Aprobar y enviar a Supervisión</w:t>
-      </w:r>
-      <w:r>
-        <w:t>. Sin radicado y factura, el sistema no deja aprobar.</w:t>
+        <w:t>Guardar</w:t>
+      </w:r>
+      <w:r>
+        <w:t xml:space="preserve">. Al registrar la fecha, la cuenta queda marcada como </w:t>
+      </w:r>
+      <w:r>
+        <w:rPr>
+          <w:b/>
+        </w:rPr>
+        <w:t>notificada</w:t>
+      </w:r>
+      <w:r>
+        <w:t xml:space="preserve"> ("Notificado al contratista el dd/mm/aaaa"); si borra la fecha, se quita la marca.</w:t>
       </w:r>
     </w:p>
     <w:p>
@@ -3409,7 +3486,7 @@
         <w:pStyle w:val="Heading3"/>
       </w:pPr>
       <w:r>
-        <w:t>Supervisión</w:t>
+        <w:t>3er filtro: factura electrónica</w:t>
       </w:r>
     </w:p>
     <w:p>
@@ -3425,24 +3502,58 @@
         <w:t xml:space="preserve">1.  </w:t>
       </w:r>
       <w:r>
-        <w:t xml:space="preserve">Revise la cuenta y pulse </w:t>
+        <w:t xml:space="preserve">Con la cuenta en Subgerencia, escriba el </w:t>
       </w:r>
       <w:r>
         <w:rPr>
           <w:b/>
         </w:rPr>
-        <w:t>✔ Aprobar y enviar a SECOP II</w:t>
-      </w:r>
-      <w:r>
-        <w:t>.</w:t>
+        <w:t>No. factura electrónica</w:t>
+      </w:r>
+      <w:r>
+        <w:t xml:space="preserve">. Puede pulsar </w:t>
+      </w:r>
+      <w:r>
+        <w:rPr>
+          <w:b/>
+        </w:rPr>
+        <w:t>Guardar factura</w:t>
+      </w:r>
+      <w:r>
+        <w:t xml:space="preserve"> si aún no va a aprobar.</w:t>
       </w:r>
     </w:p>
     <w:p>
       <w:pPr>
+        <w:spacing w:after="60"/>
+        <w:ind w:left="510" w:hanging="340"/>
+      </w:pPr>
+      <w:r>
+        <w:rPr>
+          <w:b/>
+          <w:color w:val="0F4C81"/>
+        </w:rPr>
+        <w:t xml:space="preserve">2.  </w:t>
+      </w:r>
+      <w:r>
+        <w:t xml:space="preserve">Pulse </w:t>
+      </w:r>
+      <w:r>
+        <w:rPr>
+          <w:b/>
+        </w:rPr>
+        <w:t>✔ Aprobar y enviar a Supervisión</w:t>
+      </w:r>
+      <w:r>
+        <w:t>. Sin radicado (en Datos de Subgerencia) y sin factura, el sistema no deja aprobar.</w:t>
+      </w:r>
+    </w:p>
+    <w:p>
+      <w:pPr>
         <w:pStyle w:val="Heading3"/>
       </w:pPr>
       <w:r>
-        <w:t>SECOP II</w:t>
+        <w:t>Supervisión</w:t>
       </w:r>
     </w:p>
     <w:p>
@@ -3458,6 +3569,39 @@
         <w:t xml:space="preserve">1.  </w:t>
       </w:r>
       <w:r>
+        <w:t xml:space="preserve">Revise la cuenta y pulse </w:t>
+      </w:r>
+      <w:r>
+        <w:rPr>
+          <w:b/>
+        </w:rPr>
+        <w:t>✔ Aprobar y enviar a SECOP II</w:t>
+      </w:r>
+      <w:r>
+        <w:t>.</w:t>
+      </w:r>
+    </w:p>
+    <w:p>
+      <w:pPr>
+        <w:pStyle w:val="Heading3"/>
+      </w:pPr>
+      <w:r>
+        <w:t>SECOP II</w:t>
+      </w:r>
+    </w:p>
+    <w:p>
+      <w:pPr>
+        <w:spacing w:after="60"/>
+        <w:ind w:left="510" w:hanging="340"/>
+      </w:pPr>
+      <w:r>
+        <w:rPr>
+          <w:b/>
+          <w:color w:val="0F4C81"/>
+        </w:rPr>
+        <w:t xml:space="preserve">1.  </w:t>
+      </w:r>
+      <w:r>
         <w:t xml:space="preserve">Cuando el contratista informe por correo que cargó la cuenta, cambie el </w:t>
       </w:r>
       <w:r>
@@ -3523,16 +3667,7 @@
     </w:p>
     <w:p>
       <w:r>
-        <w:t xml:space="preserve">En Subgerencia, Supervisión y SECOP II aparecen tres casillas que se guardan al marcarlas: </w:t>
-      </w:r>
-      <w:r>
-        <w:rPr>
-          <w:b/>
-        </w:rPr>
-        <w:t>Notificado al contratista</w:t>
-      </w:r>
-      <w:r>
-        <w:t xml:space="preserve">, </w:t>
+        <w:t xml:space="preserve">En Subgerencia, Supervisión y SECOP II aparecen dos casillas que se guardan al marcarlas: </w:t>
       </w:r>
       <w:r>
         <w:rPr>
@@ -3548,6 +3683,15 @@
           <w:b/>
         </w:rPr>
         <w:t>Contratista envió correo del cargue</w:t>
+      </w:r>
+      <w:r>
+        <w:t xml:space="preserve">. La notificación al contratista se registra con su fecha en </w:t>
+      </w:r>
+      <w:r>
+        <w:rPr>
+          <w:b/>
+        </w:rPr>
+        <w:t>Datos de Subgerencia</w:t>
       </w:r>
       <w:r>
         <w:t>.</w:t>
@@ -4917,7 +5061,7 @@
               <w:rPr>
                 <w:sz w:val="19"/>
               </w:rPr>
-              <w:t>Una fila por cuenta (número de pago incluido) con el formato de seguimiento: identificación, nombre, contrato, periodo, programa, resolución, municipio, valor del contrato y de la cuenta, radicado, factura, filtros de Salud Pública, Contratación y Subgerencia con fechas, supervisor, SECOP II, notificación, presupuesto, correo, pago (estado, valor, fecha, ND), proceso actual, días en el proceso, semáforo, devoluciones, certificado de cumplimiento y observaciones.</w:t>
+              <w:t>Una fila por cuenta (número de pago incluido) con el formato de seguimiento: identificación, nombre, contrato, periodo, programa, resolución, municipio, valor del contrato y de la cuenta, radicado, factura, filtros de Salud Pública, Contratación y Subgerencia con fechas, supervisor, SECOP II, fecha de notificación al contratista, presupuesto, correo, pago (estado, valor, fecha, ND), proceso actual, días en el proceso, semáforo, devoluciones, certificado de cumplimiento y observaciones.</w:t>
             </w:r>
           </w:p>
         </w:tc>
@@ -5676,7 +5820,7 @@
               <w:rPr>
                 <w:sz w:val="19"/>
               </w:rPr>
-              <w:t>Faltan el número de radicado o de factura electrónica.</w:t>
+              <w:t>Falta el número de radicado (recuadro Datos de Subgerencia) o el de factura electrónica.</w:t>
             </w:r>
           </w:p>
         </w:tc>
@@ -5698,6 +5842,46 @@
               <w:rPr>
                 <w:sz w:val="19"/>
               </w:rPr>
+              <w:t>No puedo escribir el radicado</w:t>
+            </w:r>
+          </w:p>
+        </w:tc>
+        <w:tc>
+          <w:tcPr>
+            <w:tcW w:type="dxa" w:w="5953"/>
+            <w:vAlign w:val="top"/>
+          </w:tcPr>
+          <w:p>
+            <w:pPr>
+              <w:spacing w:after="40"/>
+            </w:pPr>
+            <w:r>
+              <w:rPr>
+                <w:sz w:val="19"/>
+              </w:rPr>
+              <w:t>Solo el usuario de Subgerencia diligencia el radicado y la fecha de notificación.</w:t>
+            </w:r>
+          </w:p>
+        </w:tc>
+      </w:tr>
+      <w:tr>
+        <w:trPr>
+          <w:cantSplit w:val="true"/>
+        </w:trPr>
+        <w:tc>
+          <w:tcPr>
+            <w:tcW w:type="dxa" w:w="3628"/>
+            <w:vAlign w:val="top"/>
+            <w:shd w:val="clear" w:color="auto" w:fill="F1F6FC"/>
+          </w:tcPr>
+          <w:p>
+            <w:pPr>
+              <w:spacing w:after="40"/>
+            </w:pPr>
+            <w:r>
+              <w:rPr>
+                <w:sz w:val="19"/>
+              </w:rPr>
               <w:t>Se aprobó o devolvió una cuenta por error</w:t>
             </w:r>
           </w:p>
@@ -5706,6 +5890,7 @@
           <w:tcPr>
             <w:tcW w:type="dxa" w:w="5953"/>
             <w:vAlign w:val="top"/>
+            <w:shd w:val="clear" w:color="auto" w:fill="F1F6FC"/>
           </w:tcPr>
           <w:p>
             <w:pPr>
@@ -5741,7 +5926,6 @@
           <w:tcPr>
             <w:tcW w:type="dxa" w:w="3628"/>
             <w:vAlign w:val="top"/>
-            <w:shd w:val="clear" w:color="auto" w:fill="F1F6FC"/>
           </w:tcPr>
           <w:p>
             <w:pPr>
@@ -5759,7 +5943,6 @@
           <w:tcPr>
             <w:tcW w:type="dxa" w:w="5953"/>
             <w:vAlign w:val="top"/>
-            <w:shd w:val="clear" w:color="auto" w:fill="F1F6FC"/>
           </w:tcPr>
           <w:p>
             <w:pPr>
@@ -5782,6 +5965,7 @@
           <w:tcPr>
             <w:tcW w:type="dxa" w:w="3628"/>
             <w:vAlign w:val="top"/>
+            <w:shd w:val="clear" w:color="auto" w:fill="F1F6FC"/>
           </w:tcPr>
           <w:p>
             <w:pPr>
@@ -5799,6 +5983,7 @@
           <w:tcPr>
             <w:tcW w:type="dxa" w:w="5953"/>
             <w:vAlign w:val="top"/>
+            <w:shd w:val="clear" w:color="auto" w:fill="F1F6FC"/>
           </w:tcPr>
           <w:p>
             <w:pPr>
@@ -5821,7 +6006,6 @@
           <w:tcPr>
             <w:tcW w:type="dxa" w:w="3628"/>
             <w:vAlign w:val="top"/>
-            <w:shd w:val="clear" w:color="auto" w:fill="F1F6FC"/>
           </w:tcPr>
           <w:p>
             <w:pPr>
@@ -5839,7 +6023,6 @@
           <w:tcPr>
             <w:tcW w:type="dxa" w:w="5953"/>
             <w:vAlign w:val="top"/>
-            <w:shd w:val="clear" w:color="auto" w:fill="F1F6FC"/>
           </w:tcPr>
           <w:p>
             <w:pPr>
@@ -5862,6 +6045,7 @@
           <w:tcPr>
             <w:tcW w:type="dxa" w:w="3628"/>
             <w:vAlign w:val="top"/>
+            <w:shd w:val="clear" w:color="auto" w:fill="F1F6FC"/>
           </w:tcPr>
           <w:p>
             <w:pPr>
@@ -5879,6 +6063,7 @@
           <w:tcPr>
             <w:tcW w:type="dxa" w:w="5953"/>
             <w:vAlign w:val="top"/>
+            <w:shd w:val="clear" w:color="auto" w:fill="F1F6FC"/>
           </w:tcPr>
           <w:p>
             <w:pPr>

</xml_diff>